<commit_message>
Rebuild search record template from original 何朝友搜查笔录.docx: 45-paragraph structure with text box footer using multi-line format (办案单位/办案人员/时间 on separate lines with empty lines between), matching the original document layout exactly
</commit_message>
<xml_diff>
--- a/word-export/work/search_record_template.docx
+++ b/word-export/work/search_record_template.docx
@@ -1,8 +1,8 @@
 
 <file path=word/document.xml><?xml version="1.0" encoding="utf-8"?>
-<ns0:document xmlns:ns0="http://schemas.openxmlformats.org/wordprocessingml/2006/main" xmlns:ns1="http://schemas.openxmlformats.org/markup-compatibility/2006" xmlns:ns2="http://schemas.openxmlformats.org/drawingml/2006/wordprocessingDrawing" xmlns:ns3="http://schemas.openxmlformats.org/drawingml/2006/main" xmlns:ns4="http://schemas.openxmlformats.org/drawingml/2006/picture" xmlns:ns5="http://schemas.openxmlformats.org/officeDocument/2006/relationships" xmlns:ns6="http://schemas.microsoft.com/office/word/2010/wordprocessingShape" xmlns:ns7="urn:schemas-microsoft-com:vml" xmlns:ns8="urn:schemas-microsoft-com:office:office" ns1:Ignorable="w14 w15 wp14">
+<ns0:document xmlns:ns0="http://schemas.openxmlformats.org/wordprocessingml/2006/main" xmlns:ns1="http://schemas.openxmlformats.org/markup-compatibility/2006" xmlns:ns2="http://schemas.microsoft.com/office/word/2010/wordml" xmlns:ns3="http://schemas.openxmlformats.org/drawingml/2006/wordprocessingDrawing" xmlns:ns4="http://schemas.openxmlformats.org/drawingml/2006/main" xmlns:ns5="http://schemas.openxmlformats.org/drawingml/2006/picture" xmlns:ns6="http://schemas.openxmlformats.org/officeDocument/2006/relationships" xmlns:ns7="http://schemas.microsoft.com/office/word/2010/wordprocessingShape" xmlns:ns8="urn:schemas-microsoft-com:vml" xmlns:ns9="urn:schemas-microsoft-com:office:office" ns1:Ignorable="w14 w15 wp14">
   <ns0:body>
-    <ns0:p>
+    <ns0:p ns2:paraId="7124C8B3">
       <ns0:pPr>
         <ns0:pStyle ns0:val="2"/>
         <ns0:keepNext/>
@@ -29,7 +29,7 @@
         <ns0:t>搜 查 笔 录</ns0:t>
       </ns0:r>
     </ns0:p>
-    <ns0:p>
+    <ns0:p ns2:paraId="4C03D82A">
       <ns0:pPr>
         <ns0:pageBreakBefore ns0:val="0"/>
         <ns0:widowControl ns0:val="0"/>
@@ -270,7 +270,7 @@
         <ns0:t/>
       </ns0:r>
     </ns0:p>
-    <ns0:p>
+    <ns0:p ns2:paraId="004FBCD7">
       <ns0:pPr>
         <ns0:keepNext ns0:val="0"/>
         <ns0:keepLines ns0:val="0"/>
@@ -303,7 +303,7 @@
           <ns0:szCs ns0:val="28"/>
           <ns0:lang ns0:eastAsia="zh-CN"/>
         </ns0:rPr>
-        <ns0:t>搜查地点：</ns0:t>
+        <ns0:t>搜查地点：________</ns0:t>
       </ns0:r>
       <ns0:r>
         <ns0:rPr>
@@ -334,7 +334,7 @@
         <ns0:t xml:space="preserve"/>
       </ns0:r>
     </ns0:p>
-    <ns0:p>
+    <ns0:p ns2:paraId="6FF50881">
       <ns0:pPr>
         <ns0:keepNext ns0:val="0"/>
         <ns0:keepLines ns0:val="0"/>
@@ -366,7 +366,7 @@
           <ns0:sz ns0:val="28"/>
           <ns0:szCs ns0:val="28"/>
         </ns0:rPr>
-        <ns0:t xml:space="preserve">搜查人员姓名、单位:                、               公安局</ns0:t>
+        <ns0:t xml:space="preserve">搜查人员姓名、单位:                、               ________</ns0:t>
       </ns0:r>
       <ns0:r>
         <ns0:rPr>
@@ -436,7 +436,7 @@
         <ns0:t xml:space="preserve"/>
       </ns0:r>
     </ns0:p>
-    <ns0:p>
+    <ns0:p ns2:paraId="6D17FDDC">
       <ns0:pPr>
         <ns0:keepNext ns0:val="0"/>
         <ns0:keepLines ns0:val="0"/>
@@ -469,49 +469,49 @@
           <ns0:sz ns0:val="28"/>
           <ns0:szCs ns0:val="28"/>
         </ns0:rPr>
-        <ns0:t>当事人姓名：</ns0:t>
-      </ns0:r>
-      <ns0:r>
-        <ns0:rPr>
-          <ns0:rFonts ns0:hint="eastAsia" ns0:ascii="仿宋" ns0:hAnsi="仿宋" ns0:eastAsia="仿宋" ns0:cs="仿宋"/>
-          <ns0:color ns0:val="000000"/>
-          <ns0:sz ns0:val="28"/>
-          <ns0:szCs ns0:val="28"/>
-          <ns0:lang ns0:eastAsia="zh-CN"/>
-        </ns0:rPr>
-        <ns0:t/>
-      </ns0:r>
-      <ns0:r>
-        <ns0:rPr>
-          <ns0:rFonts ns0:hint="eastAsia" ns0:ascii="仿宋" ns0:hAnsi="仿宋" ns0:eastAsia="仿宋" ns0:cs="仿宋"/>
-          <ns0:color ns0:val="000000"/>
-          <ns0:sz ns0:val="28"/>
-          <ns0:szCs ns0:val="28"/>
-        </ns0:rPr>
-        <ns0:t/>
-      </ns0:r>
-      <ns0:r>
-        <ns0:rPr>
-          <ns0:rFonts ns0:hint="eastAsia" ns0:ascii="仿宋" ns0:hAnsi="仿宋" ns0:eastAsia="仿宋" ns0:cs="仿宋"/>
-          <ns0:color ns0:val="000000"/>
-          <ns0:sz ns0:val="28"/>
-          <ns0:szCs ns0:val="28"/>
-          <ns0:lang ns0:eastAsia="zh-CN"/>
-        </ns0:rPr>
-        <ns0:t/>
-      </ns0:r>
-      <ns0:r>
-        <ns0:rPr>
-          <ns0:rFonts ns0:hint="eastAsia" ns0:ascii="仿宋" ns0:hAnsi="仿宋" ns0:eastAsia="仿宋" ns0:cs="仿宋"/>
-          <ns0:color ns0:val="000000"/>
-          <ns0:sz ns0:val="28"/>
-          <ns0:szCs ns0:val="28"/>
-          <ns0:lang ns0:val="en-US" ns0:eastAsia="zh-CN"/>
-        </ns0:rPr>
-        <ns0:t/>
-      </ns0:r>
-    </ns0:p>
-    <ns0:p>
+        <ns0:t>当事人姓名：________</ns0:t>
+      </ns0:r>
+      <ns0:r>
+        <ns0:rPr>
+          <ns0:rFonts ns0:hint="eastAsia" ns0:ascii="仿宋" ns0:hAnsi="仿宋" ns0:eastAsia="仿宋" ns0:cs="仿宋"/>
+          <ns0:color ns0:val="000000"/>
+          <ns0:sz ns0:val="28"/>
+          <ns0:szCs ns0:val="28"/>
+          <ns0:lang ns0:eastAsia="zh-CN"/>
+        </ns0:rPr>
+        <ns0:t/>
+      </ns0:r>
+      <ns0:r>
+        <ns0:rPr>
+          <ns0:rFonts ns0:hint="eastAsia" ns0:ascii="仿宋" ns0:hAnsi="仿宋" ns0:eastAsia="仿宋" ns0:cs="仿宋"/>
+          <ns0:color ns0:val="000000"/>
+          <ns0:sz ns0:val="28"/>
+          <ns0:szCs ns0:val="28"/>
+        </ns0:rPr>
+        <ns0:t/>
+      </ns0:r>
+      <ns0:r>
+        <ns0:rPr>
+          <ns0:rFonts ns0:hint="eastAsia" ns0:ascii="仿宋" ns0:hAnsi="仿宋" ns0:eastAsia="仿宋" ns0:cs="仿宋"/>
+          <ns0:color ns0:val="000000"/>
+          <ns0:sz ns0:val="28"/>
+          <ns0:szCs ns0:val="28"/>
+          <ns0:lang ns0:eastAsia="zh-CN"/>
+        </ns0:rPr>
+        <ns0:t/>
+      </ns0:r>
+      <ns0:r>
+        <ns0:rPr>
+          <ns0:rFonts ns0:hint="eastAsia" ns0:ascii="仿宋" ns0:hAnsi="仿宋" ns0:eastAsia="仿宋" ns0:cs="仿宋"/>
+          <ns0:color ns0:val="000000"/>
+          <ns0:sz ns0:val="28"/>
+          <ns0:szCs ns0:val="28"/>
+          <ns0:lang ns0:val="en-US" ns0:eastAsia="zh-CN"/>
+        </ns0:rPr>
+        <ns0:t/>
+      </ns0:r>
+    </ns0:p>
+    <ns0:p ns2:paraId="315A0B05">
       <ns0:pPr>
         <ns0:keepNext ns0:val="0"/>
         <ns0:keepLines ns0:val="0"/>
@@ -543,7 +543,7 @@
           <ns0:sz ns0:val="28"/>
           <ns0:szCs ns0:val="28"/>
         </ns0:rPr>
-        <ns0:t>被搜查对象：</ns0:t>
+        <ns0:t>被搜查对象：嫌疑人________的人身及随身物品</ns0:t>
       </ns0:r>
       <ns0:r>
         <ns0:rPr>
@@ -584,7 +584,7 @@
         <ns0:t xml:space="preserve"/>
       </ns0:r>
     </ns0:p>
-    <ns0:p>
+    <ns0:p ns2:paraId="22AF695F">
       <ns0:pPr>
         <ns0:ind ns0:firstLine="560" ns0:firstLineChars="200"/>
         <ns0:rPr>
@@ -601,7 +601,7 @@
           <ns0:sz ns0:val="28"/>
           <ns0:szCs ns0:val="28"/>
         </ns0:rPr>
-        <ns0:t>根据______年__月__日______签发的___搜查字[____]_____号搜查证，在见证人________的见证下，对本案嫌疑人________的________进行搜查。</ns0:t>
+        <ns0:t>根据______年__月__日________签发的___搜查字[____]_____号搜查证，在见证人________的见证下，对本案嫌疑人________的人身及随身物品进行搜查。</ns0:t>
       </ns0:r>
       <ns0:r>
         <ns0:rPr>
@@ -756,7 +756,7 @@
         <ns0:t xml:space="preserve"/>
       </ns0:r>
     </ns0:p>
-    <ns0:p>
+    <ns0:p ns2:paraId="64595C62">
       <ns0:pPr>
         <ns0:ind ns0:firstLine="560" ns0:firstLineChars="200"/>
         <ns0:rPr>
@@ -991,20 +991,8 @@
         </ns0:rPr>
         <ns0:t/>
       </ns0:r>
-      <ns0:bookmarkStart ns0:id="0" ns0:name="_GoBack"/>
-      <ns0:bookmarkEnd ns0:id="0"/>
-      <ns0:r>
-        <ns0:rPr>
-          <ns0:rFonts ns0:hint="eastAsia" ns0:ascii="仿宋" ns0:hAnsi="仿宋" ns0:eastAsia="仿宋" ns0:cs="仿宋"/>
-          <ns0:color ns0:val="000000"/>
-          <ns0:sz ns0:val="28"/>
-          <ns0:szCs ns0:val="28"/>
-          <ns0:lang ns0:eastAsia="zh-CN"/>
-        </ns0:rPr>
-        <ns0:t/>
-      </ns0:r>
-    </ns0:p>
-    <ns0:p>
+    </ns0:p>
+    <ns0:p ns2:paraId="5D3DB5B2">
       <ns0:pPr>
         <ns0:ind ns0:firstLine="560" ns0:firstLineChars="200"/>
         <ns0:rPr>
@@ -1026,7 +1014,7 @@
         <ns0:t xml:space="preserve"/>
       </ns0:r>
     </ns0:p>
-    <ns0:p>
+    <ns0:p ns2:paraId="6A620CA5">
       <ns0:pPr>
         <ns0:ind ns0:firstLine="560" ns0:firstLineChars="200"/>
         <ns0:rPr>
@@ -1048,7 +1036,7 @@
         <ns0:t xml:space="preserve"/>
       </ns0:r>
     </ns0:p>
-    <ns0:p>
+    <ns0:p ns2:paraId="6FDB6592">
       <ns0:pPr>
         <ns0:ind ns0:firstLine="560" ns0:firstLineChars="200"/>
         <ns0:rPr>
@@ -1070,7 +1058,7 @@
         <ns0:t xml:space="preserve">侦查人员：                       记录人：</ns0:t>
       </ns0:r>
     </ns0:p>
-    <ns0:p>
+    <ns0:p ns2:paraId="3EDC2AC7">
       <ns0:pPr>
         <ns0:ind ns0:firstLine="560" ns0:firstLineChars="200"/>
         <ns0:rPr>
@@ -1092,7 +1080,7 @@
         <ns0:t xml:space="preserve">当事人：                         见证人：</ns0:t>
       </ns0:r>
     </ns0:p>
-    <ns0:p>
+    <ns0:p ns2:paraId="7B62BFB0">
       <ns0:pPr>
         <ns0:jc ns0:val="both"/>
         <ns0:rPr>
@@ -1103,7 +1091,7 @@
         </ns0:rPr>
       </ns0:pPr>
     </ns0:p>
-    <ns0:p>
+    <ns0:p ns2:paraId="2DCFF23F">
       <ns0:pPr>
         <ns0:pStyle ns0:val="2"/>
         <ns0:bidi ns0:val="0"/>
@@ -1163,7 +1151,7 @@
         <ns0:t/>
       </ns0:r>
     </ns0:p>
-    <ns0:p>
+    <ns0:p ns2:paraId="69394982">
       <ns0:pPr>
         <ns0:jc ns0:val="center"/>
         <ns0:rPr>
@@ -1172,6 +1160,8 @@
           <ns0:szCs ns0:val="24"/>
         </ns0:rPr>
       </ns0:pPr>
+      <ns0:bookmarkStart ns0:id="0" ns0:name="_GoBack"/>
+      <ns0:bookmarkEnd ns0:id="0"/>
       <ns0:r>
         <ns0:rPr>
           <ns0:rFonts ns0:ascii="宋体" ns0:hAnsi="宋体" ns0:eastAsia="宋体" ns0:cs="宋体"/>
@@ -1179,45 +1169,45 @@
           <ns0:szCs ns0:val="24"/>
         </ns0:rPr>
         <ns0:drawing>
-          <ns2:inline distT="0" distB="0" distL="114300" distR="114300">
-            <ns2:extent cx="2700020" cy="3599815"/>
-            <ns2:effectExtent l="0" t="0" r="12700" b="12065"/>
-            <ns2:docPr id="2" name="图片 1" descr="IMG_256"/>
-            <ns2:cNvGraphicFramePr>
-              <ns3:graphicFrameLocks noChangeAspect="1"/>
-            </ns2:cNvGraphicFramePr>
-            <ns3:graphic>
-              <ns3:graphicData uri="http://schemas.openxmlformats.org/drawingml/2006/picture">
-                <ns4:pic>
-                  <ns4:nvPicPr>
-                    <ns4:cNvPr id="2" name="图片 1" descr="IMG_256"/>
-                    <ns4:cNvPicPr>
-                      <ns3:picLocks noChangeAspect="1"/>
-                    </ns4:cNvPicPr>
-                  </ns4:nvPicPr>
-                  <ns4:blipFill>
-                    <ns3:blip ns5:embed="rId5"/>
-                    <ns3:stretch>
-                      <ns3:fillRect/>
-                    </ns3:stretch>
-                  </ns4:blipFill>
-                  <ns4:spPr>
-                    <ns3:xfrm>
-                      <ns3:off x="0" y="0"/>
-                      <ns3:ext cx="2700020" cy="3599815"/>
-                    </ns3:xfrm>
-                    <ns3:prstGeom prst="rect">
-                      <ns3:avLst/>
-                    </ns3:prstGeom>
-                    <ns3:noFill/>
-                    <ns3:ln w="9525">
-                      <ns3:noFill/>
-                    </ns3:ln>
-                  </ns4:spPr>
-                </ns4:pic>
-              </ns3:graphicData>
-            </ns3:graphic>
-          </ns2:inline>
+          <ns3:inline distT="0" distB="0" distL="114300" distR="114300">
+            <ns3:extent cx="2700020" cy="3599815"/>
+            <ns3:effectExtent l="0" t="0" r="12700" b="12065"/>
+            <ns3:docPr id="2" name="图片 1" descr="IMG_256"/>
+            <ns3:cNvGraphicFramePr>
+              <ns4:graphicFrameLocks noChangeAspect="1"/>
+            </ns3:cNvGraphicFramePr>
+            <ns4:graphic>
+              <ns4:graphicData uri="http://schemas.openxmlformats.org/drawingml/2006/picture">
+                <ns5:pic>
+                  <ns5:nvPicPr>
+                    <ns5:cNvPr id="2" name="图片 1" descr="IMG_256"/>
+                    <ns5:cNvPicPr>
+                      <ns4:picLocks noChangeAspect="1"/>
+                    </ns5:cNvPicPr>
+                  </ns5:nvPicPr>
+                  <ns5:blipFill>
+                    <ns4:blip ns6:embed="rId8"/>
+                    <ns4:stretch>
+                      <ns4:fillRect/>
+                    </ns4:stretch>
+                  </ns5:blipFill>
+                  <ns5:spPr>
+                    <ns4:xfrm>
+                      <ns4:off x="0" y="0"/>
+                      <ns4:ext cx="2700020" cy="3599815"/>
+                    </ns4:xfrm>
+                    <ns4:prstGeom prst="rect">
+                      <ns4:avLst/>
+                    </ns4:prstGeom>
+                    <ns4:noFill/>
+                    <ns4:ln w="9525">
+                      <ns4:noFill/>
+                    </ns4:ln>
+                  </ns5:spPr>
+                </ns5:pic>
+              </ns4:graphicData>
+            </ns4:graphic>
+          </ns3:inline>
         </ns0:drawing>
       </ns0:r>
       <ns0:r>
@@ -1227,49 +1217,239 @@
           <ns0:szCs ns0:val="24"/>
         </ns0:rPr>
         <ns0:drawing>
-          <ns2:inline distT="0" distB="0" distL="114300" distR="114300">
-            <ns2:extent cx="2700020" cy="3599815"/>
-            <ns2:effectExtent l="0" t="0" r="12700" b="12065"/>
-            <ns2:docPr id="3" name="图片 2" descr="IMG_256"/>
-            <ns2:cNvGraphicFramePr>
-              <ns3:graphicFrameLocks noChangeAspect="1"/>
-            </ns2:cNvGraphicFramePr>
-            <ns3:graphic>
-              <ns3:graphicData uri="http://schemas.openxmlformats.org/drawingml/2006/picture">
-                <ns4:pic>
-                  <ns4:nvPicPr>
-                    <ns4:cNvPr id="3" name="图片 2" descr="IMG_256"/>
-                    <ns4:cNvPicPr>
-                      <ns3:picLocks noChangeAspect="1"/>
-                    </ns4:cNvPicPr>
-                  </ns4:nvPicPr>
-                  <ns4:blipFill>
-                    <ns3:blip ns5:embed="rId6"/>
-                    <ns3:stretch>
-                      <ns3:fillRect/>
-                    </ns3:stretch>
-                  </ns4:blipFill>
-                  <ns4:spPr>
-                    <ns3:xfrm>
-                      <ns3:off x="0" y="0"/>
-                      <ns3:ext cx="2700020" cy="3599815"/>
-                    </ns3:xfrm>
-                    <ns3:prstGeom prst="rect">
-                      <ns3:avLst/>
-                    </ns3:prstGeom>
-                    <ns3:noFill/>
-                    <ns3:ln w="9525">
-                      <ns3:noFill/>
-                    </ns3:ln>
-                  </ns4:spPr>
-                </ns4:pic>
-              </ns3:graphicData>
-            </ns3:graphic>
-          </ns2:inline>
+          <ns3:inline distT="0" distB="0" distL="114300" distR="114300">
+            <ns3:extent cx="2700020" cy="3599815"/>
+            <ns3:effectExtent l="0" t="0" r="12700" b="12065"/>
+            <ns3:docPr id="3" name="图片 2" descr="IMG_256"/>
+            <ns3:cNvGraphicFramePr>
+              <ns4:graphicFrameLocks noChangeAspect="1"/>
+            </ns3:cNvGraphicFramePr>
+            <ns4:graphic>
+              <ns4:graphicData uri="http://schemas.openxmlformats.org/drawingml/2006/picture">
+                <ns5:pic>
+                  <ns5:nvPicPr>
+                    <ns5:cNvPr id="3" name="图片 2" descr="IMG_256"/>
+                    <ns5:cNvPicPr>
+                      <ns4:picLocks noChangeAspect="1"/>
+                    </ns5:cNvPicPr>
+                  </ns5:nvPicPr>
+                  <ns5:blipFill>
+                    <ns4:blip ns6:embed="rId7"/>
+                    <ns4:stretch>
+                      <ns4:fillRect/>
+                    </ns4:stretch>
+                  </ns5:blipFill>
+                  <ns5:spPr>
+                    <ns4:xfrm>
+                      <ns4:off x="0" y="0"/>
+                      <ns4:ext cx="2700020" cy="3599815"/>
+                    </ns4:xfrm>
+                    <ns4:prstGeom prst="rect">
+                      <ns4:avLst/>
+                    </ns4:prstGeom>
+                    <ns4:noFill/>
+                    <ns4:ln w="9525">
+                      <ns4:noFill/>
+                    </ns4:ln>
+                  </ns5:spPr>
+                </ns5:pic>
+              </ns4:graphicData>
+            </ns4:graphic>
+          </ns3:inline>
         </ns0:drawing>
       </ns0:r>
     </ns0:p>
-    <ns0:p>
+    <ns0:p ns2:paraId="6880D05A">
+      <ns0:pPr>
+        <ns0:jc ns0:val="center"/>
+        <ns0:rPr>
+          <ns0:rFonts ns0:ascii="宋体" ns0:hAnsi="宋体" ns0:eastAsia="宋体" ns0:cs="宋体"/>
+          <ns0:sz ns0:val="24"/>
+          <ns0:szCs ns0:val="24"/>
+        </ns0:rPr>
+      </ns0:pPr>
+    </ns0:p>
+    <ns0:p ns2:paraId="34EBE939">
+      <ns0:pPr>
+        <ns0:jc ns0:val="center"/>
+        <ns0:rPr>
+          <ns0:rFonts ns0:ascii="宋体" ns0:hAnsi="宋体" ns0:eastAsia="宋体" ns0:cs="宋体"/>
+          <ns0:sz ns0:val="24"/>
+          <ns0:szCs ns0:val="24"/>
+        </ns0:rPr>
+      </ns0:pPr>
+    </ns0:p>
+    <ns0:p ns2:paraId="744B6238">
+      <ns0:pPr>
+        <ns0:jc ns0:val="center"/>
+        <ns0:rPr>
+          <ns0:rFonts ns0:ascii="宋体" ns0:hAnsi="宋体" ns0:eastAsia="宋体" ns0:cs="宋体"/>
+          <ns0:sz ns0:val="24"/>
+          <ns0:szCs ns0:val="24"/>
+        </ns0:rPr>
+      </ns0:pPr>
+    </ns0:p>
+    <ns0:p ns2:paraId="67EDC23B">
+      <ns0:pPr>
+        <ns0:jc ns0:val="center"/>
+        <ns0:rPr>
+          <ns0:rFonts ns0:ascii="宋体" ns0:hAnsi="宋体" ns0:eastAsia="宋体" ns0:cs="宋体"/>
+          <ns0:sz ns0:val="24"/>
+          <ns0:szCs ns0:val="24"/>
+        </ns0:rPr>
+      </ns0:pPr>
+    </ns0:p>
+    <ns0:p ns2:paraId="696A3735">
+      <ns0:pPr>
+        <ns0:jc ns0:val="center"/>
+        <ns0:rPr>
+          <ns0:rFonts ns0:ascii="宋体" ns0:hAnsi="宋体" ns0:eastAsia="宋体" ns0:cs="宋体"/>
+          <ns0:sz ns0:val="24"/>
+          <ns0:szCs ns0:val="24"/>
+        </ns0:rPr>
+      </ns0:pPr>
+    </ns0:p>
+    <ns0:p ns2:paraId="372F2F03">
+      <ns0:pPr>
+        <ns0:jc ns0:val="center"/>
+        <ns0:rPr>
+          <ns0:rFonts ns0:ascii="宋体" ns0:hAnsi="宋体" ns0:eastAsia="宋体" ns0:cs="宋体"/>
+          <ns0:sz ns0:val="24"/>
+          <ns0:szCs ns0:val="24"/>
+        </ns0:rPr>
+      </ns0:pPr>
+    </ns0:p>
+    <ns0:p ns2:paraId="163F3668">
+      <ns0:pPr>
+        <ns0:jc ns0:val="center"/>
+        <ns0:rPr>
+          <ns0:rFonts ns0:ascii="宋体" ns0:hAnsi="宋体" ns0:eastAsia="宋体" ns0:cs="宋体"/>
+          <ns0:sz ns0:val="24"/>
+          <ns0:szCs ns0:val="24"/>
+        </ns0:rPr>
+      </ns0:pPr>
+    </ns0:p>
+    <ns0:p ns2:paraId="55684D25">
+      <ns0:pPr>
+        <ns0:jc ns0:val="center"/>
+        <ns0:rPr>
+          <ns0:rFonts ns0:ascii="宋体" ns0:hAnsi="宋体" ns0:eastAsia="宋体" ns0:cs="宋体"/>
+          <ns0:sz ns0:val="24"/>
+          <ns0:szCs ns0:val="24"/>
+        </ns0:rPr>
+      </ns0:pPr>
+    </ns0:p>
+    <ns0:p ns2:paraId="4DB92B0E">
+      <ns0:pPr>
+        <ns0:jc ns0:val="center"/>
+        <ns0:rPr>
+          <ns0:rFonts ns0:ascii="宋体" ns0:hAnsi="宋体" ns0:eastAsia="宋体" ns0:cs="宋体"/>
+          <ns0:sz ns0:val="24"/>
+          <ns0:szCs ns0:val="24"/>
+        </ns0:rPr>
+      </ns0:pPr>
+    </ns0:p>
+    <ns0:p ns2:paraId="4FBE2833">
+      <ns0:pPr>
+        <ns0:jc ns0:val="center"/>
+        <ns0:rPr>
+          <ns0:rFonts ns0:ascii="宋体" ns0:hAnsi="宋体" ns0:eastAsia="宋体" ns0:cs="宋体"/>
+          <ns0:sz ns0:val="24"/>
+          <ns0:szCs ns0:val="24"/>
+        </ns0:rPr>
+      </ns0:pPr>
+    </ns0:p>
+    <ns0:p ns2:paraId="5BEFB694">
+      <ns0:pPr>
+        <ns0:jc ns0:val="center"/>
+        <ns0:rPr>
+          <ns0:rFonts ns0:ascii="宋体" ns0:hAnsi="宋体" ns0:eastAsia="宋体" ns0:cs="宋体"/>
+          <ns0:sz ns0:val="24"/>
+          <ns0:szCs ns0:val="24"/>
+        </ns0:rPr>
+      </ns0:pPr>
+    </ns0:p>
+    <ns0:p ns2:paraId="4ED14377">
+      <ns0:pPr>
+        <ns0:jc ns0:val="center"/>
+        <ns0:rPr>
+          <ns0:rFonts ns0:ascii="宋体" ns0:hAnsi="宋体" ns0:eastAsia="宋体" ns0:cs="宋体"/>
+          <ns0:sz ns0:val="24"/>
+          <ns0:szCs ns0:val="24"/>
+        </ns0:rPr>
+      </ns0:pPr>
+    </ns0:p>
+    <ns0:p ns2:paraId="5301BA37">
+      <ns0:pPr>
+        <ns0:jc ns0:val="center"/>
+        <ns0:rPr>
+          <ns0:rFonts ns0:ascii="宋体" ns0:hAnsi="宋体" ns0:eastAsia="宋体" ns0:cs="宋体"/>
+          <ns0:sz ns0:val="24"/>
+          <ns0:szCs ns0:val="24"/>
+        </ns0:rPr>
+      </ns0:pPr>
+    </ns0:p>
+    <ns0:p ns2:paraId="639E64C7">
+      <ns0:pPr>
+        <ns0:jc ns0:val="center"/>
+        <ns0:rPr>
+          <ns0:rFonts ns0:ascii="宋体" ns0:hAnsi="宋体" ns0:eastAsia="宋体" ns0:cs="宋体"/>
+          <ns0:sz ns0:val="24"/>
+          <ns0:szCs ns0:val="24"/>
+        </ns0:rPr>
+      </ns0:pPr>
+    </ns0:p>
+    <ns0:p ns2:paraId="54BB7AFD">
+      <ns0:pPr>
+        <ns0:jc ns0:val="center"/>
+        <ns0:rPr>
+          <ns0:rFonts ns0:ascii="宋体" ns0:hAnsi="宋体" ns0:eastAsia="宋体" ns0:cs="宋体"/>
+          <ns0:sz ns0:val="24"/>
+          <ns0:szCs ns0:val="24"/>
+        </ns0:rPr>
+      </ns0:pPr>
+    </ns0:p>
+    <ns0:p ns2:paraId="4D915024">
+      <ns0:pPr>
+        <ns0:jc ns0:val="center"/>
+        <ns0:rPr>
+          <ns0:rFonts ns0:ascii="宋体" ns0:hAnsi="宋体" ns0:eastAsia="宋体" ns0:cs="宋体"/>
+          <ns0:sz ns0:val="24"/>
+          <ns0:szCs ns0:val="24"/>
+        </ns0:rPr>
+      </ns0:pPr>
+    </ns0:p>
+    <ns0:p ns2:paraId="32E85DEB">
+      <ns0:pPr>
+        <ns0:jc ns0:val="center"/>
+        <ns0:rPr>
+          <ns0:rFonts ns0:ascii="宋体" ns0:hAnsi="宋体" ns0:eastAsia="宋体" ns0:cs="宋体"/>
+          <ns0:sz ns0:val="24"/>
+          <ns0:szCs ns0:val="24"/>
+        </ns0:rPr>
+      </ns0:pPr>
+    </ns0:p>
+    <ns0:p ns2:paraId="04D7F307">
+      <ns0:pPr>
+        <ns0:jc ns0:val="center"/>
+        <ns0:rPr>
+          <ns0:rFonts ns0:ascii="宋体" ns0:hAnsi="宋体" ns0:eastAsia="宋体" ns0:cs="宋体"/>
+          <ns0:sz ns0:val="24"/>
+          <ns0:szCs ns0:val="24"/>
+        </ns0:rPr>
+      </ns0:pPr>
+    </ns0:p>
+    <ns0:p ns2:paraId="0DC7CFF2">
+      <ns0:pPr>
+        <ns0:jc ns0:val="center"/>
+        <ns0:rPr>
+          <ns0:rFonts ns0:ascii="宋体" ns0:hAnsi="宋体" ns0:eastAsia="宋体" ns0:cs="宋体"/>
+          <ns0:sz ns0:val="24"/>
+          <ns0:szCs ns0:val="24"/>
+        </ns0:rPr>
+      </ns0:pPr>
+    </ns0:p>
+    <ns0:p ns2:paraId="316F47BD">
       <ns0:pPr>
         <ns0:jc ns0:val="center"/>
         <ns0:rPr>
@@ -1280,7 +1460,7 @@
         </ns0:rPr>
       </ns0:pPr>
     </ns0:p>
-    <ns0:p>
+    <ns0:p ns2:paraId="678C2EA0">
       <ns0:pPr>
         <ns0:ind ns0:firstLine="420" ns0:firstLineChars="200"/>
         <ns0:rPr>
@@ -1431,7 +1611,7 @@
         <ns0:t/>
       </ns0:r>
     </ns0:p>
-    <ns0:p>
+    <ns0:p ns2:paraId="6059B94D">
       <ns0:pPr>
         <ns0:rPr>
           <ns0:rFonts ns0:hint="eastAsia"/>
@@ -1439,7 +1619,7 @@
         </ns0:rPr>
       </ns0:pPr>
     </ns0:p>
-    <ns0:p>
+    <ns0:p ns2:paraId="51B53E9D">
       <ns0:pPr>
         <ns0:rPr>
           <ns0:rFonts ns0:hint="eastAsia"/>
@@ -1447,7 +1627,7 @@
         </ns0:rPr>
       </ns0:pPr>
     </ns0:p>
-    <ns0:p>
+    <ns0:p ns2:paraId="5942CAFC">
       <ns0:pPr>
         <ns0:pStyle ns0:val="3"/>
         <ns0:jc ns0:val="center"/>
@@ -1456,7 +1636,7 @@
         </ns0:rPr>
       </ns0:pPr>
     </ns0:p>
-    <ns0:p>
+    <ns0:p ns2:paraId="7C64C8EB">
       <ns0:pPr>
         <ns0:pStyle ns0:val="3"/>
         <ns0:jc ns0:val="center"/>
@@ -1466,7 +1646,7 @@
         </ns0:rPr>
       </ns0:pPr>
     </ns0:p>
-    <ns0:p>
+    <ns0:p ns2:paraId="04DB843A">
       <ns0:pPr>
         <ns0:pStyle ns0:val="3"/>
         <ns0:jc ns0:val="center"/>
@@ -1476,7 +1656,7 @@
         </ns0:rPr>
       </ns0:pPr>
     </ns0:p>
-    <ns0:p>
+    <ns0:p ns2:paraId="6DD5C432">
       <ns0:pPr>
         <ns0:pStyle ns0:val="3"/>
         <ns0:jc ns0:val="center"/>
@@ -1486,7 +1666,7 @@
         </ns0:rPr>
       </ns0:pPr>
     </ns0:p>
-    <ns0:p>
+    <ns0:p ns2:paraId="29639863">
       <ns0:pPr>
         <ns0:pStyle ns0:val="3"/>
         <ns0:jc ns0:val="center"/>
@@ -1496,7 +1676,7 @@
         </ns0:rPr>
       </ns0:pPr>
     </ns0:p>
-    <ns0:p>
+    <ns0:p ns2:paraId="761EE4B5">
       <ns0:pPr>
         <ns0:pStyle ns0:val="3"/>
         <ns0:jc ns0:val="center"/>
@@ -1506,7 +1686,7 @@
         </ns0:rPr>
       </ns0:pPr>
     </ns0:p>
-    <ns0:p>
+    <ns0:p ns2:paraId="68C95783">
       <ns0:pPr>
         <ns0:pStyle ns0:val="3"/>
         <ns0:jc ns0:val="center"/>
@@ -1522,47 +1702,47 @@
         <ns1:AlternateContent>
           <ns1:Choice Requires="wps">
             <ns0:drawing>
-              <ns2:anchor distT="0" distB="0" distL="114300" distR="114300" simplePos="0" relativeHeight="251659264" behindDoc="0" locked="0" layoutInCell="1" allowOverlap="1">
-                <ns2:simplePos x="0" y="0"/>
-                <ns2:positionH relativeFrom="column">
-                  <ns2:posOffset>4006850</ns2:posOffset>
-                </ns2:positionH>
-                <ns2:positionV relativeFrom="paragraph">
-                  <ns2:posOffset>366395</ns2:posOffset>
-                </ns2:positionV>
-                <ns2:extent cx="2476500" cy="1120775"/>
-                <ns2:effectExtent l="7620" t="7620" r="11430" b="14605"/>
-                <ns2:wrapNone/>
-                <ns2:docPr id="1" name="文本框 3"/>
-                <ns2:cNvGraphicFramePr/>
-                <ns3:graphic>
-                  <ns3:graphicData uri="http://schemas.microsoft.com/office/word/2010/wordprocessingShape">
-                    <ns6:wsp>
-                      <ns6:cNvSpPr txBox="1"/>
-                      <ns6:spPr>
-                        <ns3:xfrm>
-                          <ns3:off x="0" y="0"/>
-                          <ns3:ext cx="2476500" cy="1120775"/>
-                        </ns3:xfrm>
-                        <ns3:prstGeom prst="rect">
-                          <ns3:avLst/>
-                        </ns3:prstGeom>
-                        <ns3:solidFill>
-                          <ns3:srgbClr val="FFFFFF"/>
-                        </ns3:solidFill>
-                        <ns3:ln w="15875" cap="flat" cmpd="sng">
-                          <ns3:solidFill>
-                            <ns3:srgbClr val="FFFFFF"/>
-                          </ns3:solidFill>
-                          <ns3:prstDash val="solid"/>
-                          <ns3:miter/>
-                          <ns3:headEnd type="none" w="med" len="med"/>
-                          <ns3:tailEnd type="none" w="med" len="med"/>
-                        </ns3:ln>
-                      </ns6:spPr>
-                      <ns6:txbx>
+              <ns3:anchor distT="0" distB="0" distL="114300" distR="114300" simplePos="0" relativeHeight="251659264" behindDoc="0" locked="0" layoutInCell="1" allowOverlap="1">
+                <ns3:simplePos x="0" y="0"/>
+                <ns3:positionH relativeFrom="column">
+                  <ns3:posOffset>4006850</ns3:posOffset>
+                </ns3:positionH>
+                <ns3:positionV relativeFrom="paragraph">
+                  <ns3:posOffset>366395</ns3:posOffset>
+                </ns3:positionV>
+                <ns3:extent cx="2476500" cy="1120775"/>
+                <ns3:effectExtent l="7620" t="7620" r="11430" b="14605"/>
+                <ns3:wrapNone/>
+                <ns3:docPr id="1" name="文本框 3"/>
+                <ns3:cNvGraphicFramePr/>
+                <ns4:graphic>
+                  <ns4:graphicData uri="http://schemas.microsoft.com/office/word/2010/wordprocessingShape">
+                    <ns7:wsp>
+                      <ns7:cNvSpPr txBox="1"/>
+                      <ns7:spPr>
+                        <ns4:xfrm>
+                          <ns4:off x="0" y="0"/>
+                          <ns4:ext cx="2476500" cy="1120775"/>
+                        </ns4:xfrm>
+                        <ns4:prstGeom prst="rect">
+                          <ns4:avLst/>
+                        </ns4:prstGeom>
+                        <ns4:solidFill>
+                          <ns4:srgbClr val="FFFFFF"/>
+                        </ns4:solidFill>
+                        <ns4:ln w="15875" cap="flat" cmpd="sng">
+                          <ns4:solidFill>
+                            <ns4:srgbClr val="FFFFFF"/>
+                          </ns4:solidFill>
+                          <ns4:prstDash val="solid"/>
+                          <ns4:miter/>
+                          <ns4:headEnd type="none" w="med" len="med"/>
+                          <ns4:tailEnd type="none" w="med" len="med"/>
+                        </ns4:ln>
+                      </ns7:spPr>
+                      <ns7:txbx>
                         <ns0:txbxContent>
-                          <ns0:p>
+                          <ns0:p ns2:paraId="3042CEAA">
                             <ns0:pPr>
                               <ns0:rPr>
                                 <ns0:rFonts ns0:hint="eastAsia"/>
@@ -1574,10 +1754,10 @@
                                 <ns0:rFonts ns0:hint="eastAsia"/>
                                 <ns0:lang ns0:eastAsia="zh-CN"/>
                               </ns0:rPr>
-                              <ns0:t>办案单位：XXX公安局    办案人员：XXX、XXX    时间：____年__月__日</ns0:t>
+                              <ns0:t>办案单位：________</ns0:t>
                             </ns0:r>
                           </ns0:p>
-                          <ns0:p>
+                          <ns0:p ns2:paraId="110A617C">
                             <ns0:pPr>
                               <ns0:rPr>
                                 <ns0:rFonts ns0:hint="eastAsia"/>
@@ -1585,7 +1765,7 @@
                               </ns0:rPr>
                             </ns0:pPr>
                           </ns0:p>
-                          <ns0:p>
+                          <ns0:p ns2:paraId="4F3B7586">
                             <ns0:pPr>
                               <ns0:rPr>
                                 <ns0:rFonts ns0:hint="eastAsia"/>
@@ -1597,10 +1777,10 @@
                                 <ns0:rFonts ns0:hint="eastAsia"/>
                                 <ns0:lang ns0:eastAsia="zh-CN"/>
                               </ns0:rPr>
-                              <ns0:t/>
+                              <ns0:t>办案人员：________</ns0:t>
                             </ns0:r>
                           </ns0:p>
-                          <ns0:p>
+                          <ns0:p ns2:paraId="786C442C">
                             <ns0:pPr>
                               <ns0:rPr>
                                 <ns0:rFonts ns0:hint="eastAsia"/>
@@ -1608,7 +1788,7 @@
                               </ns0:rPr>
                             </ns0:pPr>
                           </ns0:p>
-                          <ns0:p>
+                          <ns0:p ns2:paraId="512DB48C">
                             <ns0:pPr>
                               <ns0:rPr>
                                 <ns0:rFonts ns0:hint="default"/>
@@ -1620,7 +1800,7 @@
                                 <ns0:rFonts ns0:hint="eastAsia"/>
                                 <ns0:lang ns0:eastAsia="zh-CN"/>
                               </ns0:rPr>
-                              <ns0:t/>
+                              <ns0:t>时间：____年__月__日</ns0:t>
                             </ns0:r>
                             <ns0:r>
                               <ns0:rPr>
@@ -1631,24 +1811,24 @@
                             </ns0:r>
                           </ns0:p>
                         </ns0:txbxContent>
-                      </ns6:txbx>
-                      <ns6:bodyPr upright="1"/>
-                    </ns6:wsp>
-                  </ns3:graphicData>
-                </ns3:graphic>
-              </ns2:anchor>
+                      </ns7:txbx>
+                      <ns7:bodyPr upright="1"/>
+                    </ns7:wsp>
+                  </ns4:graphicData>
+                </ns4:graphic>
+              </ns3:anchor>
             </ns0:drawing>
           </ns1:Choice>
           <ns1:Fallback>
             <ns0:pict>
-              <ns7:shape id="文本框 3" ns8:spid="_x0000_s1026" ns8:spt="202" type="#_x0000_t202" style="position:absolute;left:0pt;margin-left:315.5pt;margin-top:28.85pt;height:88.25pt;width:195pt;z-index:251659264;mso-width-relative:page;mso-height-relative:page;" fillcolor="#FFFFFF" filled="t" stroked="t" coordsize="21600,21600" ns8:gfxdata="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">
-                <ns7:fill on="t" focussize="0,0"/>
-                <ns7:stroke weight="1.25pt" color="#FFFFFF" joinstyle="miter"/>
-                <ns7:imagedata ns8:title=""/>
-                <ns8:lock ns7:ext="edit" aspectratio="f"/>
-                <ns7:textbox>
+              <ns8:shape id="文本框 3" ns9:spid="_x0000_s1026" ns9:spt="202" type="#_x0000_t202" style="position:absolute;left:0pt;margin-left:315.5pt;margin-top:28.85pt;height:88.25pt;width:195pt;z-index:251659264;mso-width-relative:page;mso-height-relative:page;" fillcolor="#FFFFFF" filled="t" stroked="t" coordsize="21600,21600" ns9:gfxdata="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">
+                <ns8:fill on="t" focussize="0,0"/>
+                <ns8:stroke weight="1.25pt" color="#FFFFFF" joinstyle="miter"/>
+                <ns8:imagedata ns9:title=""/>
+                <ns9:lock ns8:ext="edit" aspectratio="f"/>
+                <ns8:textbox>
                   <ns0:txbxContent>
-                    <ns0:p>
+                    <ns0:p ns2:paraId="3042CEAA">
                       <ns0:pPr>
                         <ns0:rPr>
                           <ns0:rFonts ns0:hint="eastAsia"/>
@@ -1660,10 +1840,10 @@
                           <ns0:rFonts ns0:hint="eastAsia"/>
                           <ns0:lang ns0:eastAsia="zh-CN"/>
                         </ns0:rPr>
-                        <ns0:t/>
+                        <ns0:t>办案单位：________</ns0:t>
                       </ns0:r>
                     </ns0:p>
-                    <ns0:p>
+                    <ns0:p ns2:paraId="110A617C">
                       <ns0:pPr>
                         <ns0:rPr>
                           <ns0:rFonts ns0:hint="eastAsia"/>
@@ -1671,7 +1851,7 @@
                         </ns0:rPr>
                       </ns0:pPr>
                     </ns0:p>
-                    <ns0:p>
+                    <ns0:p ns2:paraId="4F3B7586">
                       <ns0:pPr>
                         <ns0:rPr>
                           <ns0:rFonts ns0:hint="eastAsia"/>
@@ -1683,10 +1863,10 @@
                           <ns0:rFonts ns0:hint="eastAsia"/>
                           <ns0:lang ns0:eastAsia="zh-CN"/>
                         </ns0:rPr>
-                        <ns0:t/>
+                        <ns0:t>办案人员：________</ns0:t>
                       </ns0:r>
                     </ns0:p>
-                    <ns0:p>
+                    <ns0:p ns2:paraId="786C442C">
                       <ns0:pPr>
                         <ns0:rPr>
                           <ns0:rFonts ns0:hint="eastAsia"/>
@@ -1694,7 +1874,7 @@
                         </ns0:rPr>
                       </ns0:pPr>
                     </ns0:p>
-                    <ns0:p>
+                    <ns0:p ns2:paraId="512DB48C">
                       <ns0:pPr>
                         <ns0:rPr>
                           <ns0:rFonts ns0:hint="default"/>
@@ -1706,7 +1886,7 @@
                           <ns0:rFonts ns0:hint="eastAsia"/>
                           <ns0:lang ns0:eastAsia="zh-CN"/>
                         </ns0:rPr>
-                        <ns0:t/>
+                        <ns0:t>时间：____年__月__日</ns0:t>
                       </ns0:r>
                       <ns0:r>
                         <ns0:rPr>
@@ -1717,15 +1897,15 @@
                       </ns0:r>
                     </ns0:p>
                   </ns0:txbxContent>
-                </ns7:textbox>
-              </ns7:shape>
+                </ns8:textbox>
+              </ns8:shape>
             </ns0:pict>
           </ns1:Fallback>
         </ns1:AlternateContent>
       </ns0:r>
     </ns0:p>
     <ns0:sectPr>
-      <ns0:footerReference ns5:id="rId3" ns0:type="default"/>
+      <ns0:footerReference ns6:id="rId3" ns0:type="default"/>
       <ns0:pgSz ns0:w="11906" ns0:h="16838"/>
       <ns0:pgMar ns0:top="1440" ns0:right="1366" ns0:bottom="1440" ns0:left="1080" ns0:header="851" ns0:footer="992" ns0:gutter="0"/>
       <ns0:cols ns0:space="720" ns0:num="1"/>
@@ -1842,7 +2022,7 @@
         </mc:Choice>
         <mc:Fallback>
           <w:pict>
-            <v:rect id="文本框 1" o:spid="_x0000_s1026" o:spt="1" style="position:absolute;left:0pt;margin-top:0pt;height:144pt;width:144pt;mso-position-horizontal:center;mso-position-horizontal-relative:margin;mso-wrap-style:none;z-index:251659264;mso-width-relative:page;mso-height-relative:page;" filled="f" stroked="f" coordsize="21600,21600" o:gfxdata="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">
+            <v:rect id="文本框 1" o:spid="_x0000_s1026" o:spt="1" style="position:absolute;left:0pt;margin-top:0pt;height:144pt;width:144pt;mso-position-horizontal:center;mso-position-horizontal-relative:margin;mso-wrap-style:none;z-index:251659264;mso-width-relative:page;mso-height-relative:page;" filled="f" stroked="f" coordsize="21600,21600" o:gfxdata="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">
               <v:fill on="f" focussize="0,0"/>
               <v:stroke on="f"/>
               <v:imagedata o:title=""/>
@@ -1905,13 +2085,14 @@
 </file>
 
 <file path=word/styles.xml><?xml version="1.0" encoding="utf-8"?>
-<w:styles xmlns:mc="http://schemas.openxmlformats.org/markup-compatibility/2006" xmlns:o="urn:schemas-microsoft-com:office:office" xmlns:r="http://schemas.openxmlformats.org/officeDocument/2006/relationships" xmlns:m="http://schemas.openxmlformats.org/officeDocument/2006/math" xmlns:v="urn:schemas-microsoft-com:vml" xmlns:w="http://schemas.openxmlformats.org/wordprocessingml/2006/main" xmlns:w14="http://schemas.microsoft.com/office/word/2010/wordml" xmlns:w10="urn:schemas-microsoft-com:office:word" xmlns:sl="http://schemas.openxmlformats.org/schemaLibrary/2006/main" mc:Ignorable="w14">
+<w:styles xmlns:mc="http://schemas.openxmlformats.org/markup-compatibility/2006" xmlns:o="urn:schemas-microsoft-com:office:office" xmlns:r="http://schemas.openxmlformats.org/officeDocument/2006/relationships" xmlns:m="http://schemas.openxmlformats.org/officeDocument/2006/math" xmlns:v="urn:schemas-microsoft-com:vml" xmlns:w="http://schemas.openxmlformats.org/wordprocessingml/2006/main" xmlns:w14="http://schemas.microsoft.com/office/word/2010/wordml" xmlns:w10="urn:schemas-microsoft-com:office:word" xmlns:sl="http://schemas.openxmlformats.org/schemaLibrary/2006/main" xmlns:wpsCustomData="http://www.wps.cn/officeDocument/2013/wpsCustomData" mc:Ignorable="w14">
   <w:docDefaults>
     <w:rPrDefault>
       <w:rPr>
         <w:rFonts w:ascii="Times New Roman" w:hAnsi="Times New Roman" w:eastAsia="宋体" w:cs="Times New Roman"/>
       </w:rPr>
     </w:rPrDefault>
+    <w:pPrDefault/>
   </w:docDefaults>
   <w:latentStyles w:count="260" w:defQFormat="0" w:defUnhideWhenUsed="1" w:defSemiHidden="1" w:defUIPriority="99" w:defLockedState="0">
     <w:lsdException w:qFormat="1" w:unhideWhenUsed="0" w:uiPriority="0" w:semiHidden="0" w:name="Normal"/>
@@ -2208,7 +2389,6 @@
     <w:qFormat/>
     <w:uiPriority w:val="99"/>
     <w:tblPr>
-      <w:tblLayout w:type="fixed"/>
       <w:tblCellMar>
         <w:top w:w="0" w:type="dxa"/>
         <w:left w:w="108" w:type="dxa"/>
@@ -2593,9 +2773,7 @@
 
 <file path=customXml/item1.xml><?xml version="1.0" encoding="utf-8"?>
 <s:customData xmlns="http://www.wps.cn/officeDocument/2013/wpsCustomData" xmlns:s="http://www.wps.cn/officeDocument/2013/wpsCustomData">
-  <customSectProps>
-    <customSectPr/>
-  </customSectProps>
+  <customSectProps/>
   <customShpExts>
     <customShpInfo spid="_x0000_s1026" textRotate="1"/>
   </customShpExts>

</xml_diff>